<commit_message>
created logo for project
</commit_message>
<xml_diff>
--- a/Documentation/Fyp Proposal/ContracthubPk Proposal.docx
+++ b/Documentation/Fyp Proposal/ContracthubPk Proposal.docx
@@ -2265,41 +2265,167 @@
           <w:sz w:val="23"/>
           <w:szCs w:val="23"/>
         </w:rPr>
-        <w:t xml:space="preserve">In Pakistan’s freelance market, most freelancers and clients rely on informal communication channels such as social media or messaging apps to negotiate and manage projects. This often leads to trust issues, payment fraud, lack of formal contracts, and project disputes. Existing international platforms like Fiverr and Upwork charge high commissions and do not support local payment gateways, making them less accessible for many users. Therefore, there is a need for a secure, automated web platform that allows freelancers and clients to create digital contracts, manage </w:t>
-      </w:r>
-      <w:proofErr w:type="gramStart"/>
-      <w:r>
-        <w:rPr>
-          <w:color w:val="000000"/>
-          <w:sz w:val="23"/>
-          <w:szCs w:val="23"/>
-        </w:rPr>
-        <w:t>escrow</w:t>
-      </w:r>
-      <w:r>
-        <w:rPr>
-          <w:color w:val="000000"/>
-          <w:sz w:val="23"/>
-          <w:szCs w:val="23"/>
-        </w:rPr>
-        <w:t xml:space="preserve"> </w:t>
-      </w:r>
-      <w:r>
-        <w:rPr>
-          <w:color w:val="000000"/>
-          <w:sz w:val="23"/>
-          <w:szCs w:val="23"/>
-        </w:rPr>
-        <w:t>based</w:t>
-      </w:r>
-      <w:proofErr w:type="gramEnd"/>
-      <w:r>
-        <w:rPr>
-          <w:color w:val="000000"/>
-          <w:sz w:val="23"/>
-          <w:szCs w:val="23"/>
-        </w:rPr>
-        <w:t xml:space="preserve"> payments, and ensure transparent collaboration using local payment methods such as Easypaisa</w:t>
+        <w:t>In Pakistan’s freelance market, most</w:t>
+      </w:r>
+      <w:r>
+        <w:rPr>
+          <w:color w:val="000000"/>
+          <w:sz w:val="23"/>
+          <w:szCs w:val="23"/>
+        </w:rPr>
+        <w:t xml:space="preserve"> of the time</w:t>
+      </w:r>
+      <w:r>
+        <w:rPr>
+          <w:color w:val="000000"/>
+          <w:sz w:val="23"/>
+          <w:szCs w:val="23"/>
+        </w:rPr>
+        <w:t xml:space="preserve"> freelancers and clients rely on informal communication channels such as social media or messaging apps</w:t>
+      </w:r>
+      <w:r>
+        <w:rPr>
+          <w:color w:val="000000"/>
+          <w:sz w:val="23"/>
+          <w:szCs w:val="23"/>
+        </w:rPr>
+        <w:t xml:space="preserve"> like WhatsApp, Facebook and </w:t>
+      </w:r>
+      <w:r>
+        <w:rPr>
+          <w:color w:val="000000"/>
+          <w:sz w:val="23"/>
+          <w:szCs w:val="23"/>
+        </w:rPr>
+        <w:t xml:space="preserve">LinkedIn </w:t>
+      </w:r>
+      <w:r>
+        <w:rPr>
+          <w:color w:val="000000"/>
+          <w:sz w:val="23"/>
+          <w:szCs w:val="23"/>
+        </w:rPr>
+        <w:t>to</w:t>
+      </w:r>
+      <w:r>
+        <w:rPr>
+          <w:color w:val="000000"/>
+          <w:sz w:val="23"/>
+          <w:szCs w:val="23"/>
+        </w:rPr>
+        <w:t xml:space="preserve"> negotiate and manage projects. This often leads to trust issues, payment </w:t>
+      </w:r>
+      <w:r>
+        <w:rPr>
+          <w:color w:val="000000"/>
+          <w:sz w:val="23"/>
+          <w:szCs w:val="23"/>
+        </w:rPr>
+        <w:t>scam</w:t>
+      </w:r>
+      <w:r>
+        <w:rPr>
+          <w:color w:val="000000"/>
+          <w:sz w:val="23"/>
+          <w:szCs w:val="23"/>
+        </w:rPr>
+        <w:t xml:space="preserve">, lack of formal contracts, and project </w:t>
+      </w:r>
+      <w:r>
+        <w:rPr>
+          <w:color w:val="000000"/>
+          <w:sz w:val="23"/>
+          <w:szCs w:val="23"/>
+        </w:rPr>
+        <w:t>disagreements</w:t>
+      </w:r>
+      <w:r>
+        <w:rPr>
+          <w:color w:val="000000"/>
+          <w:sz w:val="23"/>
+          <w:szCs w:val="23"/>
+        </w:rPr>
+        <w:t xml:space="preserve">. Existing international platforms like Fiverr and Upwork charge high </w:t>
+      </w:r>
+      <w:r>
+        <w:rPr>
+          <w:color w:val="000000"/>
+          <w:sz w:val="23"/>
+          <w:szCs w:val="23"/>
+        </w:rPr>
+        <w:t>charges</w:t>
+      </w:r>
+      <w:r>
+        <w:rPr>
+          <w:color w:val="000000"/>
+          <w:sz w:val="23"/>
+          <w:szCs w:val="23"/>
+        </w:rPr>
+        <w:t xml:space="preserve"> and do not support local payment gateways, making them less accessible for many users. </w:t>
+      </w:r>
+      <w:r>
+        <w:rPr>
+          <w:color w:val="000000"/>
+          <w:sz w:val="23"/>
+          <w:szCs w:val="23"/>
+        </w:rPr>
+        <w:t>So</w:t>
+      </w:r>
+      <w:r>
+        <w:rPr>
+          <w:color w:val="000000"/>
+          <w:sz w:val="23"/>
+          <w:szCs w:val="23"/>
+        </w:rPr>
+        <w:t xml:space="preserve">, there is a need for a secure, automated web platform that allows freelancers and clients to </w:t>
+      </w:r>
+      <w:r>
+        <w:rPr>
+          <w:color w:val="000000"/>
+          <w:sz w:val="23"/>
+          <w:szCs w:val="23"/>
+        </w:rPr>
+        <w:t>make</w:t>
+      </w:r>
+      <w:r>
+        <w:rPr>
+          <w:color w:val="000000"/>
+          <w:sz w:val="23"/>
+          <w:szCs w:val="23"/>
+        </w:rPr>
+        <w:t xml:space="preserve"> digital contracts, manage escrow payments, and </w:t>
+      </w:r>
+      <w:r>
+        <w:rPr>
+          <w:color w:val="000000"/>
+          <w:sz w:val="23"/>
+          <w:szCs w:val="23"/>
+        </w:rPr>
+        <w:t>confirm</w:t>
+      </w:r>
+      <w:r>
+        <w:rPr>
+          <w:color w:val="000000"/>
+          <w:sz w:val="23"/>
+          <w:szCs w:val="23"/>
+        </w:rPr>
+        <w:t xml:space="preserve"> transparent </w:t>
+      </w:r>
+      <w:r>
+        <w:rPr>
+          <w:color w:val="000000"/>
+          <w:sz w:val="23"/>
+          <w:szCs w:val="23"/>
+        </w:rPr>
+        <w:t>association</w:t>
+      </w:r>
+      <w:r>
+        <w:rPr>
+          <w:color w:val="000000"/>
+          <w:sz w:val="23"/>
+          <w:szCs w:val="23"/>
+        </w:rPr>
+        <w:t xml:space="preserve"> using local payment methods such as Easypaisa</w:t>
       </w:r>
       <w:r>
         <w:rPr>
@@ -2366,7 +2492,263 @@
           <w:sz w:val="23"/>
           <w:szCs w:val="23"/>
         </w:rPr>
-        <w:t>The proposed project, titled “A Secure Web Platform for Managing Freelance Contracts and Escrow Payments using Local Payment Gateways,” aims to address the growing issues of trust, payment security, and contract management within Pakistan’s local freelance market. Many freelancers and clients in Pakistan prefer to work outside international platforms like Fiverr and Upwork due to their high service charges and intense competition. However, working independently through social media or informal communication channels often leads to payment disputes, project delays, and a lack of accountability, as there is no standardized system to ensure safe transactions or enforce digital agreements.</w:t>
+        <w:t>The proposed project</w:t>
+      </w:r>
+      <w:r>
+        <w:rPr>
+          <w:color w:val="000000"/>
+          <w:sz w:val="23"/>
+          <w:szCs w:val="23"/>
+        </w:rPr>
+        <w:t xml:space="preserve"> with the </w:t>
+      </w:r>
+      <w:r>
+        <w:rPr>
+          <w:color w:val="000000"/>
+          <w:sz w:val="23"/>
+          <w:szCs w:val="23"/>
+        </w:rPr>
+        <w:t xml:space="preserve">titled “A Secure Web Platform for Managing Freelance Contracts and Escrow Payments using Local Payment Gateways,” </w:t>
+      </w:r>
+      <w:r>
+        <w:rPr>
+          <w:color w:val="000000"/>
+          <w:sz w:val="23"/>
+          <w:szCs w:val="23"/>
+        </w:rPr>
+        <w:t>purposes</w:t>
+      </w:r>
+      <w:r>
+        <w:rPr>
+          <w:color w:val="000000"/>
+          <w:sz w:val="23"/>
+          <w:szCs w:val="23"/>
+        </w:rPr>
+        <w:t xml:space="preserve"> to address the growing issues of trust, payment </w:t>
+      </w:r>
+      <w:r>
+        <w:rPr>
+          <w:color w:val="000000"/>
+          <w:sz w:val="23"/>
+          <w:szCs w:val="23"/>
+        </w:rPr>
+        <w:t>safety</w:t>
+      </w:r>
+      <w:r>
+        <w:rPr>
+          <w:color w:val="000000"/>
+          <w:sz w:val="23"/>
+          <w:szCs w:val="23"/>
+        </w:rPr>
+        <w:t xml:space="preserve">, and contract </w:t>
+      </w:r>
+      <w:r>
+        <w:rPr>
+          <w:color w:val="000000"/>
+          <w:sz w:val="23"/>
+          <w:szCs w:val="23"/>
+        </w:rPr>
+        <w:t>managing</w:t>
+      </w:r>
+      <w:r>
+        <w:rPr>
+          <w:color w:val="000000"/>
+          <w:sz w:val="23"/>
+          <w:szCs w:val="23"/>
+        </w:rPr>
+        <w:t xml:space="preserve"> </w:t>
+      </w:r>
+      <w:r>
+        <w:rPr>
+          <w:color w:val="000000"/>
+          <w:sz w:val="23"/>
+          <w:szCs w:val="23"/>
+        </w:rPr>
+        <w:t>inside</w:t>
+      </w:r>
+      <w:r>
+        <w:rPr>
+          <w:color w:val="000000"/>
+          <w:sz w:val="23"/>
+          <w:szCs w:val="23"/>
+        </w:rPr>
+        <w:t xml:space="preserve"> Pakistan’s local freelance market. Many</w:t>
+      </w:r>
+      <w:r>
+        <w:rPr>
+          <w:color w:val="000000"/>
+          <w:sz w:val="23"/>
+          <w:szCs w:val="23"/>
+        </w:rPr>
+        <w:t xml:space="preserve"> time</w:t>
+      </w:r>
+      <w:r>
+        <w:rPr>
+          <w:color w:val="000000"/>
+          <w:sz w:val="23"/>
+          <w:szCs w:val="23"/>
+        </w:rPr>
+        <w:t xml:space="preserve"> freelancers and clients in Pakistan </w:t>
+      </w:r>
+      <w:r>
+        <w:rPr>
+          <w:color w:val="000000"/>
+          <w:sz w:val="23"/>
+          <w:szCs w:val="23"/>
+        </w:rPr>
+        <w:t>choose</w:t>
+      </w:r>
+      <w:r>
+        <w:rPr>
+          <w:color w:val="000000"/>
+          <w:sz w:val="23"/>
+          <w:szCs w:val="23"/>
+        </w:rPr>
+        <w:t xml:space="preserve"> to work outside international platforms like Fiverr and Upwork due to their high </w:t>
+      </w:r>
+      <w:r>
+        <w:rPr>
+          <w:color w:val="000000"/>
+          <w:sz w:val="23"/>
+          <w:szCs w:val="23"/>
+        </w:rPr>
+        <w:t>package</w:t>
+      </w:r>
+      <w:r>
+        <w:rPr>
+          <w:color w:val="000000"/>
+          <w:sz w:val="23"/>
+          <w:szCs w:val="23"/>
+        </w:rPr>
+        <w:t xml:space="preserve"> charges and </w:t>
+      </w:r>
+      <w:r>
+        <w:rPr>
+          <w:color w:val="000000"/>
+          <w:sz w:val="23"/>
+          <w:szCs w:val="23"/>
+        </w:rPr>
+        <w:t>strong</w:t>
+      </w:r>
+      <w:r>
+        <w:rPr>
+          <w:color w:val="000000"/>
+          <w:sz w:val="23"/>
+          <w:szCs w:val="23"/>
+        </w:rPr>
+        <w:t xml:space="preserve"> competition. </w:t>
+      </w:r>
+      <w:r>
+        <w:rPr>
+          <w:color w:val="000000"/>
+          <w:sz w:val="23"/>
+          <w:szCs w:val="23"/>
+        </w:rPr>
+        <w:t>But</w:t>
+      </w:r>
+      <w:r>
+        <w:rPr>
+          <w:color w:val="000000"/>
+          <w:sz w:val="23"/>
+          <w:szCs w:val="23"/>
+        </w:rPr>
+        <w:t xml:space="preserve">, working independently </w:t>
+      </w:r>
+      <w:r>
+        <w:rPr>
+          <w:color w:val="000000"/>
+          <w:sz w:val="23"/>
+          <w:szCs w:val="23"/>
+        </w:rPr>
+        <w:t>over</w:t>
+      </w:r>
+      <w:r>
+        <w:rPr>
+          <w:color w:val="000000"/>
+          <w:sz w:val="23"/>
+          <w:szCs w:val="23"/>
+        </w:rPr>
+        <w:t xml:space="preserve"> social media or informal communication </w:t>
+      </w:r>
+      <w:r>
+        <w:rPr>
+          <w:color w:val="000000"/>
+          <w:sz w:val="23"/>
+          <w:szCs w:val="23"/>
+        </w:rPr>
+        <w:t>medium</w:t>
+      </w:r>
+      <w:r>
+        <w:rPr>
+          <w:color w:val="000000"/>
+          <w:sz w:val="23"/>
+          <w:szCs w:val="23"/>
+        </w:rPr>
+        <w:t xml:space="preserve"> often leads to payment </w:t>
+      </w:r>
+      <w:r>
+        <w:rPr>
+          <w:color w:val="000000"/>
+          <w:sz w:val="23"/>
+          <w:szCs w:val="23"/>
+        </w:rPr>
+        <w:t>disagreements</w:t>
+      </w:r>
+      <w:r>
+        <w:rPr>
+          <w:color w:val="000000"/>
+          <w:sz w:val="23"/>
+          <w:szCs w:val="23"/>
+        </w:rPr>
+        <w:t xml:space="preserve">, project delays, and a lack of </w:t>
+      </w:r>
+      <w:r>
+        <w:rPr>
+          <w:color w:val="000000"/>
+          <w:sz w:val="23"/>
+          <w:szCs w:val="23"/>
+        </w:rPr>
+        <w:t>responsibility</w:t>
+      </w:r>
+      <w:r>
+        <w:rPr>
+          <w:color w:val="000000"/>
+          <w:sz w:val="23"/>
+          <w:szCs w:val="23"/>
+        </w:rPr>
+        <w:t xml:space="preserve">, as there is no standardized system to </w:t>
+      </w:r>
+      <w:r>
+        <w:rPr>
+          <w:color w:val="000000"/>
+          <w:sz w:val="23"/>
+          <w:szCs w:val="23"/>
+        </w:rPr>
+        <w:t>confirm</w:t>
+      </w:r>
+      <w:r>
+        <w:rPr>
+          <w:color w:val="000000"/>
+          <w:sz w:val="23"/>
+          <w:szCs w:val="23"/>
+        </w:rPr>
+        <w:t xml:space="preserve"> safe transactions or </w:t>
+      </w:r>
+      <w:r>
+        <w:rPr>
+          <w:color w:val="000000"/>
+          <w:sz w:val="23"/>
+          <w:szCs w:val="23"/>
+        </w:rPr>
+        <w:t>impose</w:t>
+      </w:r>
+      <w:r>
+        <w:rPr>
+          <w:color w:val="000000"/>
+          <w:sz w:val="23"/>
+          <w:szCs w:val="23"/>
+        </w:rPr>
+        <w:t xml:space="preserve"> digital agreements.</w:t>
       </w:r>
     </w:p>
     <w:p>
@@ -2403,7 +2785,277 @@
           <w:szCs w:val="23"/>
           <w:lang w:val="en-PK"/>
         </w:rPr>
-        <w:t>This project proposes a web-based platform that enables freelancers and clients to create, manage, and execute freelance contracts securely while ensuring fair and transparent payments through escrow mechanisms. The system will integrate local payment gateways such as Easypaisa, JazzCash, and Visa/MasterCard to support seamless and accessible financial transactions. Key features will include contract creation, milestone-based payments, automated escrow release, dispute resolution, and user verification to ensure reliability and confidence between both parties.</w:t>
+        <w:t>This project proposes a web</w:t>
+      </w:r>
+      <w:r>
+        <w:rPr>
+          <w:color w:val="000000"/>
+          <w:sz w:val="23"/>
+          <w:szCs w:val="23"/>
+          <w:lang w:val="en-PK"/>
+        </w:rPr>
+        <w:t xml:space="preserve"> </w:t>
+      </w:r>
+      <w:r>
+        <w:rPr>
+          <w:color w:val="000000"/>
+          <w:sz w:val="23"/>
+          <w:szCs w:val="23"/>
+          <w:lang w:val="en-PK"/>
+        </w:rPr>
+        <w:t xml:space="preserve">based platform that enables freelancers and clients to create, manage, and </w:t>
+      </w:r>
+      <w:r>
+        <w:rPr>
+          <w:color w:val="000000"/>
+          <w:sz w:val="23"/>
+          <w:szCs w:val="23"/>
+          <w:lang w:val="en-PK"/>
+        </w:rPr>
+        <w:t>implement</w:t>
+      </w:r>
+      <w:r>
+        <w:rPr>
+          <w:color w:val="000000"/>
+          <w:sz w:val="23"/>
+          <w:szCs w:val="23"/>
+          <w:lang w:val="en-PK"/>
+        </w:rPr>
+        <w:t xml:space="preserve"> freelance contracts </w:t>
+      </w:r>
+      <w:r>
+        <w:rPr>
+          <w:color w:val="000000"/>
+          <w:sz w:val="23"/>
+          <w:szCs w:val="23"/>
+          <w:lang w:val="en-PK"/>
+        </w:rPr>
+        <w:t>fast</w:t>
+      </w:r>
+      <w:r>
+        <w:rPr>
+          <w:color w:val="000000"/>
+          <w:sz w:val="23"/>
+          <w:szCs w:val="23"/>
+          <w:lang w:val="en-PK"/>
+        </w:rPr>
+        <w:t xml:space="preserve"> while </w:t>
+      </w:r>
+      <w:r>
+        <w:rPr>
+          <w:color w:val="000000"/>
+          <w:sz w:val="23"/>
+          <w:szCs w:val="23"/>
+          <w:lang w:val="en-PK"/>
+        </w:rPr>
+        <w:t>confirming</w:t>
+      </w:r>
+      <w:r>
+        <w:rPr>
+          <w:color w:val="000000"/>
+          <w:sz w:val="23"/>
+          <w:szCs w:val="23"/>
+          <w:lang w:val="en-PK"/>
+        </w:rPr>
+        <w:t xml:space="preserve"> </w:t>
+      </w:r>
+      <w:r>
+        <w:rPr>
+          <w:color w:val="000000"/>
+          <w:sz w:val="23"/>
+          <w:szCs w:val="23"/>
+          <w:lang w:val="en-PK"/>
+        </w:rPr>
+        <w:t>reasonable</w:t>
+      </w:r>
+      <w:r>
+        <w:rPr>
+          <w:color w:val="000000"/>
+          <w:sz w:val="23"/>
+          <w:szCs w:val="23"/>
+          <w:lang w:val="en-PK"/>
+        </w:rPr>
+        <w:t xml:space="preserve"> and transparent payments through escrow mechanisms. The system will integrate local payment gateways such as Easypaisa</w:t>
+      </w:r>
+      <w:r>
+        <w:rPr>
+          <w:color w:val="000000"/>
+          <w:sz w:val="23"/>
+          <w:szCs w:val="23"/>
+          <w:lang w:val="en-PK"/>
+        </w:rPr>
+        <w:t xml:space="preserve"> and </w:t>
+      </w:r>
+      <w:r>
+        <w:rPr>
+          <w:color w:val="000000"/>
+          <w:sz w:val="23"/>
+          <w:szCs w:val="23"/>
+          <w:lang w:val="en-PK"/>
+        </w:rPr>
+        <w:t>JazzCash</w:t>
+      </w:r>
+      <w:r>
+        <w:rPr>
+          <w:color w:val="000000"/>
+          <w:sz w:val="23"/>
+          <w:szCs w:val="23"/>
+          <w:lang w:val="en-PK"/>
+        </w:rPr>
+        <w:t xml:space="preserve"> </w:t>
+      </w:r>
+      <w:r>
+        <w:rPr>
+          <w:color w:val="000000"/>
+          <w:sz w:val="23"/>
+          <w:szCs w:val="23"/>
+          <w:lang w:val="en-PK"/>
+        </w:rPr>
+        <w:t xml:space="preserve">to support </w:t>
+      </w:r>
+      <w:r>
+        <w:rPr>
+          <w:color w:val="000000"/>
+          <w:sz w:val="23"/>
+          <w:szCs w:val="23"/>
+          <w:lang w:val="en-PK"/>
+        </w:rPr>
+        <w:t>continuous</w:t>
+      </w:r>
+      <w:r>
+        <w:rPr>
+          <w:color w:val="000000"/>
+          <w:sz w:val="23"/>
+          <w:szCs w:val="23"/>
+          <w:lang w:val="en-PK"/>
+        </w:rPr>
+        <w:t xml:space="preserve"> and </w:t>
+      </w:r>
+      <w:r>
+        <w:rPr>
+          <w:color w:val="000000"/>
+          <w:sz w:val="23"/>
+          <w:szCs w:val="23"/>
+          <w:lang w:val="en-PK"/>
+        </w:rPr>
+        <w:t>manageable</w:t>
+      </w:r>
+      <w:r>
+        <w:rPr>
+          <w:color w:val="000000"/>
+          <w:sz w:val="23"/>
+          <w:szCs w:val="23"/>
+          <w:lang w:val="en-PK"/>
+        </w:rPr>
+        <w:t xml:space="preserve"> financial transactions. Key features will include contract creation, milestone</w:t>
+      </w:r>
+      <w:r>
+        <w:rPr>
+          <w:color w:val="000000"/>
+          <w:sz w:val="23"/>
+          <w:szCs w:val="23"/>
+          <w:lang w:val="en-PK"/>
+        </w:rPr>
+        <w:t xml:space="preserve"> </w:t>
+      </w:r>
+      <w:r>
+        <w:rPr>
+          <w:color w:val="000000"/>
+          <w:sz w:val="23"/>
+          <w:szCs w:val="23"/>
+          <w:lang w:val="en-PK"/>
+        </w:rPr>
+        <w:t xml:space="preserve">based payments, automated escrow release, </w:t>
+      </w:r>
+      <w:r>
+        <w:rPr>
+          <w:color w:val="000000"/>
+          <w:sz w:val="23"/>
+          <w:szCs w:val="23"/>
+          <w:lang w:val="en-PK"/>
+        </w:rPr>
+        <w:t>disagreement</w:t>
+      </w:r>
+      <w:r>
+        <w:rPr>
+          <w:color w:val="000000"/>
+          <w:sz w:val="23"/>
+          <w:szCs w:val="23"/>
+          <w:lang w:val="en-PK"/>
+        </w:rPr>
+        <w:t xml:space="preserve"> </w:t>
+      </w:r>
+      <w:r>
+        <w:rPr>
+          <w:color w:val="000000"/>
+          <w:sz w:val="23"/>
+          <w:szCs w:val="23"/>
+          <w:lang w:val="en-PK"/>
+        </w:rPr>
+        <w:t>resolve</w:t>
+      </w:r>
+      <w:r>
+        <w:rPr>
+          <w:color w:val="000000"/>
+          <w:sz w:val="23"/>
+          <w:szCs w:val="23"/>
+          <w:lang w:val="en-PK"/>
+        </w:rPr>
+        <w:t xml:space="preserve">, and user </w:t>
+      </w:r>
+      <w:r>
+        <w:rPr>
+          <w:color w:val="000000"/>
+          <w:sz w:val="23"/>
+          <w:szCs w:val="23"/>
+          <w:lang w:val="en-PK"/>
+        </w:rPr>
+        <w:t>confirmation</w:t>
+      </w:r>
+      <w:r>
+        <w:rPr>
+          <w:color w:val="000000"/>
+          <w:sz w:val="23"/>
+          <w:szCs w:val="23"/>
+          <w:lang w:val="en-PK"/>
+        </w:rPr>
+        <w:t xml:space="preserve"> to </w:t>
+      </w:r>
+      <w:r>
+        <w:rPr>
+          <w:color w:val="000000"/>
+          <w:sz w:val="23"/>
+          <w:szCs w:val="23"/>
+          <w:lang w:val="en-PK"/>
+        </w:rPr>
+        <w:t>confirm</w:t>
+      </w:r>
+      <w:r>
+        <w:rPr>
+          <w:color w:val="000000"/>
+          <w:sz w:val="23"/>
+          <w:szCs w:val="23"/>
+          <w:lang w:val="en-PK"/>
+        </w:rPr>
+        <w:t xml:space="preserve"> </w:t>
+      </w:r>
+      <w:r>
+        <w:rPr>
+          <w:color w:val="000000"/>
+          <w:sz w:val="23"/>
+          <w:szCs w:val="23"/>
+          <w:lang w:val="en-PK"/>
+        </w:rPr>
+        <w:t>consistency</w:t>
+      </w:r>
+      <w:r>
+        <w:rPr>
+          <w:color w:val="000000"/>
+          <w:sz w:val="23"/>
+          <w:szCs w:val="23"/>
+          <w:lang w:val="en-PK"/>
+        </w:rPr>
+        <w:t xml:space="preserve"> and confidence between both parties.</w:t>
       </w:r>
     </w:p>
     <w:p>
@@ -2441,7 +3093,196 @@
           <w:szCs w:val="23"/>
           <w:lang w:val="en-PK"/>
         </w:rPr>
-        <w:t>By automating the freelance workflow and ensuring secure payment management, this system will serve as a trusted digital bridge between freelancers and clients in Pakistan. It will promote digital trust, financial inclusion, and transparent collaboration, while reducing the dependency on costly international freelancing platforms.</w:t>
+        <w:t>In</w:t>
+      </w:r>
+      <w:r>
+        <w:rPr>
+          <w:color w:val="000000"/>
+          <w:sz w:val="23"/>
+          <w:szCs w:val="23"/>
+          <w:lang w:val="en-PK"/>
+        </w:rPr>
+        <w:t xml:space="preserve"> automati</w:t>
+      </w:r>
+      <w:r>
+        <w:rPr>
+          <w:color w:val="000000"/>
+          <w:sz w:val="23"/>
+          <w:szCs w:val="23"/>
+          <w:lang w:val="en-PK"/>
+        </w:rPr>
+        <w:t xml:space="preserve">on of </w:t>
+      </w:r>
+      <w:r>
+        <w:rPr>
+          <w:color w:val="000000"/>
+          <w:sz w:val="23"/>
+          <w:szCs w:val="23"/>
+          <w:lang w:val="en-PK"/>
+        </w:rPr>
+        <w:t xml:space="preserve">freelance </w:t>
+      </w:r>
+      <w:r>
+        <w:rPr>
+          <w:color w:val="000000"/>
+          <w:sz w:val="23"/>
+          <w:szCs w:val="23"/>
+          <w:lang w:val="en-PK"/>
+        </w:rPr>
+        <w:t>contracts</w:t>
+      </w:r>
+      <w:r>
+        <w:rPr>
+          <w:color w:val="000000"/>
+          <w:sz w:val="23"/>
+          <w:szCs w:val="23"/>
+          <w:lang w:val="en-PK"/>
+        </w:rPr>
+        <w:t xml:space="preserve"> and </w:t>
+      </w:r>
+      <w:r>
+        <w:rPr>
+          <w:color w:val="000000"/>
+          <w:sz w:val="23"/>
+          <w:szCs w:val="23"/>
+          <w:lang w:val="en-PK"/>
+        </w:rPr>
+        <w:t>confirming</w:t>
+      </w:r>
+      <w:r>
+        <w:rPr>
+          <w:color w:val="000000"/>
+          <w:sz w:val="23"/>
+          <w:szCs w:val="23"/>
+          <w:lang w:val="en-PK"/>
+        </w:rPr>
+        <w:t xml:space="preserve"> secure payment management, this system will </w:t>
+      </w:r>
+      <w:r>
+        <w:rPr>
+          <w:color w:val="000000"/>
+          <w:sz w:val="23"/>
+          <w:szCs w:val="23"/>
+          <w:lang w:val="en-PK"/>
+        </w:rPr>
+        <w:t>help</w:t>
+      </w:r>
+      <w:r>
+        <w:rPr>
+          <w:color w:val="000000"/>
+          <w:sz w:val="23"/>
+          <w:szCs w:val="23"/>
+          <w:lang w:val="en-PK"/>
+        </w:rPr>
+        <w:t xml:space="preserve"> as a </w:t>
+      </w:r>
+      <w:r>
+        <w:rPr>
+          <w:color w:val="000000"/>
+          <w:sz w:val="23"/>
+          <w:szCs w:val="23"/>
+          <w:lang w:val="en-PK"/>
+        </w:rPr>
+        <w:t>reliable</w:t>
+      </w:r>
+      <w:r>
+        <w:rPr>
+          <w:color w:val="000000"/>
+          <w:sz w:val="23"/>
+          <w:szCs w:val="23"/>
+          <w:lang w:val="en-PK"/>
+        </w:rPr>
+        <w:t xml:space="preserve"> digital </w:t>
+      </w:r>
+      <w:r>
+        <w:rPr>
+          <w:color w:val="000000"/>
+          <w:sz w:val="23"/>
+          <w:szCs w:val="23"/>
+          <w:lang w:val="en-PK"/>
+        </w:rPr>
+        <w:t>bond</w:t>
+      </w:r>
+      <w:r>
+        <w:rPr>
+          <w:color w:val="000000"/>
+          <w:sz w:val="23"/>
+          <w:szCs w:val="23"/>
+          <w:lang w:val="en-PK"/>
+        </w:rPr>
+        <w:t xml:space="preserve"> between freelancers and clients in Pakistan. It will promote digital trust, financial </w:t>
+      </w:r>
+      <w:r>
+        <w:rPr>
+          <w:color w:val="000000"/>
+          <w:sz w:val="23"/>
+          <w:szCs w:val="23"/>
+          <w:lang w:val="en-PK"/>
+        </w:rPr>
+        <w:t>presence</w:t>
+      </w:r>
+      <w:r>
+        <w:rPr>
+          <w:color w:val="000000"/>
+          <w:sz w:val="23"/>
+          <w:szCs w:val="23"/>
+          <w:lang w:val="en-PK"/>
+        </w:rPr>
+        <w:t xml:space="preserve">, and transparent </w:t>
+      </w:r>
+      <w:r>
+        <w:rPr>
+          <w:color w:val="000000"/>
+          <w:sz w:val="23"/>
+          <w:szCs w:val="23"/>
+          <w:lang w:val="en-PK"/>
+        </w:rPr>
+        <w:t>association</w:t>
+      </w:r>
+      <w:r>
+        <w:rPr>
+          <w:color w:val="000000"/>
+          <w:sz w:val="23"/>
+          <w:szCs w:val="23"/>
+          <w:lang w:val="en-PK"/>
+        </w:rPr>
+        <w:t xml:space="preserve">, while reducing the </w:t>
+      </w:r>
+      <w:r>
+        <w:rPr>
+          <w:color w:val="000000"/>
+          <w:sz w:val="23"/>
+          <w:szCs w:val="23"/>
+          <w:lang w:val="en-PK"/>
+        </w:rPr>
+        <w:t>dependence</w:t>
+      </w:r>
+      <w:r>
+        <w:rPr>
+          <w:color w:val="000000"/>
+          <w:sz w:val="23"/>
+          <w:szCs w:val="23"/>
+          <w:lang w:val="en-PK"/>
+        </w:rPr>
+        <w:t xml:space="preserve"> on </w:t>
+      </w:r>
+      <w:r>
+        <w:rPr>
+          <w:color w:val="000000"/>
+          <w:sz w:val="23"/>
+          <w:szCs w:val="23"/>
+          <w:lang w:val="en-PK"/>
+        </w:rPr>
+        <w:t>expensive</w:t>
+      </w:r>
+      <w:r>
+        <w:rPr>
+          <w:color w:val="000000"/>
+          <w:sz w:val="23"/>
+          <w:szCs w:val="23"/>
+          <w:lang w:val="en-PK"/>
+        </w:rPr>
+        <w:t xml:space="preserve"> international freelancing platforms.</w:t>
       </w:r>
     </w:p>
     <w:p>
@@ -2503,15 +3344,159 @@
           <w:sz w:val="23"/>
           <w:szCs w:val="23"/>
         </w:rPr>
-        <w:t xml:space="preserve">: </w:t>
-      </w:r>
-      <w:r>
-        <w:rPr>
-          <w:color w:val="000000"/>
-          <w:sz w:val="23"/>
-          <w:szCs w:val="23"/>
-        </w:rPr>
-        <w:t>to develop a secure web platform that enables freelancers and clients to manage contracts and payments through an automated escrow system. It aims to eliminate trust issues and payment fraud by integrating local gateways such as Easypaisa</w:t>
+        <w:t>:</w:t>
+      </w:r>
+      <w:r>
+        <w:rPr>
+          <w:color w:val="000000"/>
+          <w:sz w:val="23"/>
+          <w:szCs w:val="23"/>
+        </w:rPr>
+        <w:t xml:space="preserve"> The main purpose is</w:t>
+      </w:r>
+      <w:r>
+        <w:rPr>
+          <w:color w:val="000000"/>
+          <w:sz w:val="23"/>
+          <w:szCs w:val="23"/>
+        </w:rPr>
+        <w:t xml:space="preserve"> </w:t>
+      </w:r>
+      <w:r>
+        <w:rPr>
+          <w:color w:val="000000"/>
+          <w:sz w:val="23"/>
+          <w:szCs w:val="23"/>
+        </w:rPr>
+        <w:t xml:space="preserve">to </w:t>
+      </w:r>
+      <w:r>
+        <w:rPr>
+          <w:color w:val="000000"/>
+          <w:sz w:val="23"/>
+          <w:szCs w:val="23"/>
+        </w:rPr>
+        <w:t>create</w:t>
+      </w:r>
+      <w:r>
+        <w:rPr>
+          <w:color w:val="000000"/>
+          <w:sz w:val="23"/>
+          <w:szCs w:val="23"/>
+        </w:rPr>
+        <w:t xml:space="preserve"> a secure web platform that </w:t>
+      </w:r>
+      <w:r>
+        <w:rPr>
+          <w:color w:val="000000"/>
+          <w:sz w:val="23"/>
+          <w:szCs w:val="23"/>
+        </w:rPr>
+        <w:t>lets</w:t>
+      </w:r>
+      <w:r>
+        <w:rPr>
+          <w:color w:val="000000"/>
+          <w:sz w:val="23"/>
+          <w:szCs w:val="23"/>
+        </w:rPr>
+        <w:t xml:space="preserve"> freelancers and clients to </w:t>
+      </w:r>
+      <w:r>
+        <w:rPr>
+          <w:color w:val="000000"/>
+          <w:sz w:val="23"/>
+          <w:szCs w:val="23"/>
+        </w:rPr>
+        <w:t>accomplish</w:t>
+      </w:r>
+      <w:r>
+        <w:rPr>
+          <w:color w:val="000000"/>
+          <w:sz w:val="23"/>
+          <w:szCs w:val="23"/>
+        </w:rPr>
+        <w:t xml:space="preserve"> contracts and payments through an </w:t>
+      </w:r>
+      <w:r>
+        <w:rPr>
+          <w:color w:val="000000"/>
+          <w:sz w:val="23"/>
+          <w:szCs w:val="23"/>
+        </w:rPr>
+        <w:t>automatic</w:t>
+      </w:r>
+      <w:r>
+        <w:rPr>
+          <w:color w:val="000000"/>
+          <w:sz w:val="23"/>
+          <w:szCs w:val="23"/>
+        </w:rPr>
+        <w:t xml:space="preserve"> escrow system. It </w:t>
+      </w:r>
+      <w:r>
+        <w:rPr>
+          <w:color w:val="000000"/>
+          <w:sz w:val="23"/>
+          <w:szCs w:val="23"/>
+        </w:rPr>
+        <w:t>purposes</w:t>
+      </w:r>
+      <w:r>
+        <w:rPr>
+          <w:color w:val="000000"/>
+          <w:sz w:val="23"/>
+          <w:szCs w:val="23"/>
+        </w:rPr>
+        <w:t xml:space="preserve"> to </w:t>
+      </w:r>
+      <w:r>
+        <w:rPr>
+          <w:color w:val="000000"/>
+          <w:sz w:val="23"/>
+          <w:szCs w:val="23"/>
+        </w:rPr>
+        <w:t>remove</w:t>
+      </w:r>
+      <w:r>
+        <w:rPr>
+          <w:color w:val="000000"/>
+          <w:sz w:val="23"/>
+          <w:szCs w:val="23"/>
+        </w:rPr>
+        <w:t xml:space="preserve"> trust </w:t>
+      </w:r>
+      <w:r>
+        <w:rPr>
+          <w:color w:val="000000"/>
+          <w:sz w:val="23"/>
+          <w:szCs w:val="23"/>
+        </w:rPr>
+        <w:t>problems</w:t>
+      </w:r>
+      <w:r>
+        <w:rPr>
+          <w:color w:val="000000"/>
+          <w:sz w:val="23"/>
+          <w:szCs w:val="23"/>
+        </w:rPr>
+        <w:t xml:space="preserve"> and payment </w:t>
+      </w:r>
+      <w:r>
+        <w:rPr>
+          <w:color w:val="000000"/>
+          <w:sz w:val="23"/>
+          <w:szCs w:val="23"/>
+        </w:rPr>
+        <w:t>scam</w:t>
+      </w:r>
+      <w:r>
+        <w:rPr>
+          <w:color w:val="000000"/>
+          <w:sz w:val="23"/>
+          <w:szCs w:val="23"/>
+        </w:rPr>
+        <w:t xml:space="preserve"> by integrating local gateways such as Easypaisa</w:t>
       </w:r>
       <w:r>
         <w:rPr>
@@ -2580,7 +3565,55 @@
           <w:sz w:val="23"/>
           <w:szCs w:val="23"/>
         </w:rPr>
-        <w:t>The scope of ContracthubPk is limited to designing and implementing a secure web</w:t>
+        <w:t>The scope of ContracthubPk is</w:t>
+      </w:r>
+      <w:r>
+        <w:rPr>
+          <w:color w:val="000000"/>
+          <w:sz w:val="23"/>
+          <w:szCs w:val="23"/>
+        </w:rPr>
+        <w:t xml:space="preserve"> partially</w:t>
+      </w:r>
+      <w:r>
+        <w:rPr>
+          <w:color w:val="000000"/>
+          <w:sz w:val="23"/>
+          <w:szCs w:val="23"/>
+        </w:rPr>
+        <w:t xml:space="preserve"> limited to </w:t>
+      </w:r>
+      <w:r>
+        <w:rPr>
+          <w:color w:val="000000"/>
+          <w:sz w:val="23"/>
+          <w:szCs w:val="23"/>
+        </w:rPr>
+        <w:t>design</w:t>
+      </w:r>
+      <w:r>
+        <w:rPr>
+          <w:color w:val="000000"/>
+          <w:sz w:val="23"/>
+          <w:szCs w:val="23"/>
+        </w:rPr>
+        <w:t xml:space="preserve"> and implement</w:t>
+      </w:r>
+      <w:r>
+        <w:rPr>
+          <w:color w:val="000000"/>
+          <w:sz w:val="23"/>
+          <w:szCs w:val="23"/>
+        </w:rPr>
+        <w:t>ation of</w:t>
+      </w:r>
+      <w:r>
+        <w:rPr>
+          <w:color w:val="000000"/>
+          <w:sz w:val="23"/>
+          <w:szCs w:val="23"/>
+        </w:rPr>
+        <w:t xml:space="preserve"> a secure web</w:t>
       </w:r>
       <w:r>
         <w:rPr>
@@ -2596,7 +3629,23 @@
           <w:sz w:val="23"/>
           <w:szCs w:val="23"/>
         </w:rPr>
-        <w:t>based freelance contract and escrow management system for Pakistan’s local market within an academic environment.</w:t>
+        <w:t xml:space="preserve">based freelance contract and escrow management system for Pakistan’s local market </w:t>
+      </w:r>
+      <w:r>
+        <w:rPr>
+          <w:color w:val="000000"/>
+          <w:sz w:val="23"/>
+          <w:szCs w:val="23"/>
+        </w:rPr>
+        <w:t>inside</w:t>
+      </w:r>
+      <w:r>
+        <w:rPr>
+          <w:color w:val="000000"/>
+          <w:sz w:val="23"/>
+          <w:szCs w:val="23"/>
+        </w:rPr>
+        <w:t xml:space="preserve"> an academic environment.</w:t>
       </w:r>
     </w:p>
     <w:p>
@@ -2671,7 +3720,34 @@
           <w:szCs w:val="23"/>
           <w:lang w:val="en-PK"/>
         </w:rPr>
-        <w:t>Connecting freelancers and clients for transparent collaboration.</w:t>
+        <w:t>Joining</w:t>
+      </w:r>
+      <w:r>
+        <w:rPr>
+          <w:color w:val="000000"/>
+          <w:sz w:val="23"/>
+          <w:szCs w:val="23"/>
+          <w:lang w:val="en-PK"/>
+        </w:rPr>
+        <w:t xml:space="preserve"> freelancers and clients for transparent </w:t>
+      </w:r>
+      <w:r>
+        <w:rPr>
+          <w:color w:val="000000"/>
+          <w:sz w:val="23"/>
+          <w:szCs w:val="23"/>
+          <w:lang w:val="en-PK"/>
+        </w:rPr>
+        <w:t>association</w:t>
+      </w:r>
+      <w:r>
+        <w:rPr>
+          <w:color w:val="000000"/>
+          <w:sz w:val="23"/>
+          <w:szCs w:val="23"/>
+          <w:lang w:val="en-PK"/>
+        </w:rPr>
+        <w:t>.</w:t>
       </w:r>
     </w:p>
     <w:p>
@@ -2698,7 +3774,79 @@
           <w:szCs w:val="23"/>
           <w:lang w:val="en-PK"/>
         </w:rPr>
-        <w:t>Implemented an automated escrow system to ensure safe and milestone-based payments</w:t>
+        <w:t>Applied</w:t>
+      </w:r>
+      <w:r>
+        <w:rPr>
+          <w:color w:val="000000"/>
+          <w:sz w:val="23"/>
+          <w:szCs w:val="23"/>
+          <w:lang w:val="en-PK"/>
+        </w:rPr>
+        <w:t xml:space="preserve"> an </w:t>
+      </w:r>
+      <w:r>
+        <w:rPr>
+          <w:color w:val="000000"/>
+          <w:sz w:val="23"/>
+          <w:szCs w:val="23"/>
+          <w:lang w:val="en-PK"/>
+        </w:rPr>
+        <w:t>automatic</w:t>
+      </w:r>
+      <w:r>
+        <w:rPr>
+          <w:color w:val="000000"/>
+          <w:sz w:val="23"/>
+          <w:szCs w:val="23"/>
+          <w:lang w:val="en-PK"/>
+        </w:rPr>
+        <w:t xml:space="preserve"> escrow system to </w:t>
+      </w:r>
+      <w:r>
+        <w:rPr>
+          <w:color w:val="000000"/>
+          <w:sz w:val="23"/>
+          <w:szCs w:val="23"/>
+          <w:lang w:val="en-PK"/>
+        </w:rPr>
+        <w:t>confirm</w:t>
+      </w:r>
+      <w:r>
+        <w:rPr>
+          <w:color w:val="000000"/>
+          <w:sz w:val="23"/>
+          <w:szCs w:val="23"/>
+          <w:lang w:val="en-PK"/>
+        </w:rPr>
+        <w:t xml:space="preserve"> safe and milestone</w:t>
+      </w:r>
+      <w:r>
+        <w:rPr>
+          <w:color w:val="000000"/>
+          <w:sz w:val="23"/>
+          <w:szCs w:val="23"/>
+          <w:lang w:val="en-PK"/>
+        </w:rPr>
+        <w:t xml:space="preserve"> </w:t>
+      </w:r>
+      <w:r>
+        <w:rPr>
+          <w:color w:val="000000"/>
+          <w:sz w:val="23"/>
+          <w:szCs w:val="23"/>
+          <w:lang w:val="en-PK"/>
+        </w:rPr>
+        <w:t xml:space="preserve">based </w:t>
+      </w:r>
+      <w:r>
+        <w:rPr>
+          <w:color w:val="000000"/>
+          <w:sz w:val="23"/>
+          <w:szCs w:val="23"/>
+          <w:lang w:val="en-PK"/>
+        </w:rPr>
+        <w:t>expenditures</w:t>
       </w:r>
     </w:p>
     <w:p>
@@ -2752,7 +3900,52 @@
           <w:szCs w:val="23"/>
           <w:lang w:val="en-PK"/>
         </w:rPr>
-        <w:t>Enable digital contract creation and management for clarity</w:t>
+        <w:t>Allow</w:t>
+      </w:r>
+      <w:r>
+        <w:rPr>
+          <w:color w:val="000000"/>
+          <w:sz w:val="23"/>
+          <w:szCs w:val="23"/>
+          <w:lang w:val="en-PK"/>
+        </w:rPr>
+        <w:t xml:space="preserve"> digital contract </w:t>
+      </w:r>
+      <w:r>
+        <w:rPr>
+          <w:color w:val="000000"/>
+          <w:sz w:val="23"/>
+          <w:szCs w:val="23"/>
+          <w:lang w:val="en-PK"/>
+        </w:rPr>
+        <w:t>formation</w:t>
+      </w:r>
+      <w:r>
+        <w:rPr>
+          <w:color w:val="000000"/>
+          <w:sz w:val="23"/>
+          <w:szCs w:val="23"/>
+          <w:lang w:val="en-PK"/>
+        </w:rPr>
+        <w:t xml:space="preserve"> and </w:t>
+      </w:r>
+      <w:r>
+        <w:rPr>
+          <w:color w:val="000000"/>
+          <w:sz w:val="23"/>
+          <w:szCs w:val="23"/>
+          <w:lang w:val="en-PK"/>
+        </w:rPr>
+        <w:t>managing</w:t>
+      </w:r>
+      <w:r>
+        <w:rPr>
+          <w:color w:val="000000"/>
+          <w:sz w:val="23"/>
+          <w:szCs w:val="23"/>
+          <w:lang w:val="en-PK"/>
+        </w:rPr>
+        <w:t xml:space="preserve"> for clarity</w:t>
       </w:r>
     </w:p>
     <w:p>
@@ -2779,7 +3972,52 @@
           <w:szCs w:val="23"/>
           <w:lang w:val="en-PK"/>
         </w:rPr>
-        <w:t>Provide a dispute resolution and review system</w:t>
+        <w:t>Deliver</w:t>
+      </w:r>
+      <w:r>
+        <w:rPr>
+          <w:color w:val="000000"/>
+          <w:sz w:val="23"/>
+          <w:szCs w:val="23"/>
+          <w:lang w:val="en-PK"/>
+        </w:rPr>
+        <w:t xml:space="preserve"> a </w:t>
+      </w:r>
+      <w:r>
+        <w:rPr>
+          <w:color w:val="000000"/>
+          <w:sz w:val="23"/>
+          <w:szCs w:val="23"/>
+          <w:lang w:val="en-PK"/>
+        </w:rPr>
+        <w:t>disagreement</w:t>
+      </w:r>
+      <w:r>
+        <w:rPr>
+          <w:color w:val="000000"/>
+          <w:sz w:val="23"/>
+          <w:szCs w:val="23"/>
+          <w:lang w:val="en-PK"/>
+        </w:rPr>
+        <w:t xml:space="preserve"> resolution and </w:t>
+      </w:r>
+      <w:r>
+        <w:rPr>
+          <w:color w:val="000000"/>
+          <w:sz w:val="23"/>
+          <w:szCs w:val="23"/>
+          <w:lang w:val="en-PK"/>
+        </w:rPr>
+        <w:t>assessment</w:t>
+      </w:r>
+      <w:r>
+        <w:rPr>
+          <w:color w:val="000000"/>
+          <w:sz w:val="23"/>
+          <w:szCs w:val="23"/>
+          <w:lang w:val="en-PK"/>
+        </w:rPr>
+        <w:t xml:space="preserve"> system</w:t>
       </w:r>
     </w:p>
     <w:p>
@@ -2835,7 +4073,25 @@
         </w:numPr>
       </w:pPr>
       <w:r>
-        <w:t xml:space="preserve">The system allows users to create an account and log in securely as a </w:t>
+        <w:t xml:space="preserve">The system </w:t>
+      </w:r>
+      <w:r>
+        <w:t>lets</w:t>
+      </w:r>
+      <w:r>
+        <w:t xml:space="preserve"> users to </w:t>
+      </w:r>
+      <w:r>
+        <w:t>make</w:t>
+      </w:r>
+      <w:r>
+        <w:t xml:space="preserve"> an account and log in </w:t>
+      </w:r>
+      <w:r>
+        <w:t>gradually</w:t>
+      </w:r>
+      <w:r>
+        <w:t xml:space="preserve"> as a </w:t>
       </w:r>
       <w:r>
         <w:rPr>
@@ -2865,7 +4121,19 @@
         </w:numPr>
       </w:pPr>
       <w:r>
-        <w:t>Users can create and update their personal profiles, including basic information and payment details.</w:t>
+        <w:t xml:space="preserve">Users can </w:t>
+      </w:r>
+      <w:r>
+        <w:t>make</w:t>
+      </w:r>
+      <w:r>
+        <w:t xml:space="preserve"> and update their personal profiles, including basic </w:t>
+      </w:r>
+      <w:r>
+        <w:t>info</w:t>
+      </w:r>
+      <w:r>
+        <w:t xml:space="preserve"> and payment details.</w:t>
       </w:r>
     </w:p>
     <w:p>
@@ -2877,16 +4145,40 @@
         </w:numPr>
       </w:pPr>
       <w:r>
-        <w:t xml:space="preserve">Both clients and freelancers can create a </w:t>
+        <w:t xml:space="preserve">Both clients and freelancers can </w:t>
+      </w:r>
+      <w:r>
+        <w:t>make</w:t>
+      </w:r>
+      <w:r>
+        <w:t xml:space="preserve"> a </w:t>
       </w:r>
       <w:r>
         <w:rPr>
           <w:rStyle w:val="Strong"/>
         </w:rPr>
-        <w:t>digital contract</w:t>
-      </w:r>
-      <w:r>
-        <w:t xml:space="preserve"> by defining scope, budget, and milestones.</w:t>
+        <w:t xml:space="preserve">digital </w:t>
+      </w:r>
+      <w:r>
+        <w:rPr>
+          <w:rStyle w:val="Strong"/>
+        </w:rPr>
+        <w:t>agreement</w:t>
+      </w:r>
+      <w:r>
+        <w:t xml:space="preserve"> by </w:t>
+      </w:r>
+      <w:r>
+        <w:t>essential</w:t>
+      </w:r>
+      <w:r>
+        <w:t xml:space="preserve"> scope, </w:t>
+      </w:r>
+      <w:r>
+        <w:t>cost, time</w:t>
+      </w:r>
+      <w:r>
+        <w:t xml:space="preserve"> and milestones.</w:t>
       </w:r>
     </w:p>
     <w:p>
@@ -2898,7 +4190,19 @@
         </w:numPr>
       </w:pPr>
       <w:r>
-        <w:t>The system enables users to view, accept, or reject contract requests.</w:t>
+        <w:t xml:space="preserve">The system </w:t>
+      </w:r>
+      <w:r>
+        <w:t>allows</w:t>
+      </w:r>
+      <w:r>
+        <w:t xml:space="preserve"> users to view, accept, or reject contract </w:t>
+      </w:r>
+      <w:r>
+        <w:t>appeals</w:t>
+      </w:r>
+      <w:r>
+        <w:t>.</w:t>
       </w:r>
     </w:p>
     <w:p>
@@ -2946,7 +4250,19 @@
         <w:t>escrow state</w:t>
       </w:r>
       <w:r>
-        <w:t xml:space="preserve"> until contractual conditions are fulfilled.</w:t>
+        <w:t xml:space="preserve"> until </w:t>
+      </w:r>
+      <w:r>
+        <w:t>promised</w:t>
+      </w:r>
+      <w:r>
+        <w:t xml:space="preserve"> conditions are </w:t>
+      </w:r>
+      <w:r>
+        <w:t>satisfied</w:t>
+      </w:r>
+      <w:r>
+        <w:t>.</w:t>
       </w:r>
     </w:p>
     <w:p>
@@ -2970,7 +4286,13 @@
         </w:numPr>
       </w:pPr>
       <w:r>
-        <w:t>Clients can review submitted work and approve or request changes.</w:t>
+        <w:t xml:space="preserve">Clients can </w:t>
+      </w:r>
+      <w:r>
+        <w:t>assess</w:t>
+      </w:r>
+      <w:r>
+        <w:t xml:space="preserve"> submitted work and approve or request changes.</w:t>
       </w:r>
     </w:p>
     <w:p>
@@ -2982,7 +4304,19 @@
         </w:numPr>
       </w:pPr>
       <w:r>
-        <w:t>Upon client approval, the system automatically releases the escrow payment to the freelancer.</w:t>
+        <w:t>O</w:t>
+      </w:r>
+      <w:r>
+        <w:t>n</w:t>
+      </w:r>
+      <w:r>
+        <w:t xml:space="preserve"> client approval, the system automatically </w:t>
+      </w:r>
+      <w:r>
+        <w:t>issues</w:t>
+      </w:r>
+      <w:r>
+        <w:t xml:space="preserve"> the escrow payment to the freelancer.</w:t>
       </w:r>
     </w:p>
     <w:p>
@@ -2994,7 +4328,25 @@
         </w:numPr>
       </w:pPr>
       <w:r>
-        <w:t>Users can raise disputes if disagreements occur regarding work or payment.</w:t>
+        <w:t xml:space="preserve">Users can raise </w:t>
+      </w:r>
+      <w:r>
+        <w:t>disagreements</w:t>
+      </w:r>
+      <w:r>
+        <w:t xml:space="preserve"> if disagreements </w:t>
+      </w:r>
+      <w:r>
+        <w:t>happen</w:t>
+      </w:r>
+      <w:r>
+        <w:t xml:space="preserve"> </w:t>
+      </w:r>
+      <w:r>
+        <w:t>about</w:t>
+      </w:r>
+      <w:r>
+        <w:t xml:space="preserve"> work or payment.</w:t>
       </w:r>
     </w:p>
     <w:p>
@@ -3006,7 +4358,25 @@
         </w:numPr>
       </w:pPr>
       <w:r>
-        <w:t>The admin can review disputes, evaluate evidence, and decide payment outcomes.</w:t>
+        <w:t xml:space="preserve">The admin can review </w:t>
+      </w:r>
+      <w:r>
+        <w:t>arguments</w:t>
+      </w:r>
+      <w:r>
+        <w:t xml:space="preserve">, </w:t>
+      </w:r>
+      <w:r>
+        <w:t>assess</w:t>
+      </w:r>
+      <w:r>
+        <w:t xml:space="preserve"> evidence, and decide payment </w:t>
+      </w:r>
+      <w:r>
+        <w:t>consequences</w:t>
+      </w:r>
+      <w:r>
+        <w:t>.</w:t>
       </w:r>
     </w:p>
     <w:p>
@@ -3018,7 +4388,25 @@
         </w:numPr>
       </w:pPr>
       <w:r>
-        <w:t>The system sends notifications to users for important actions such as contract creation, payment updates, and dispute decisions.</w:t>
+        <w:t xml:space="preserve">The system sends </w:t>
+      </w:r>
+      <w:r>
+        <w:t>announcements</w:t>
+      </w:r>
+      <w:r>
+        <w:t xml:space="preserve"> to users for important </w:t>
+      </w:r>
+      <w:r>
+        <w:t>activities</w:t>
+      </w:r>
+      <w:r>
+        <w:t xml:space="preserve"> such as contract creation, payment updates, and </w:t>
+      </w:r>
+      <w:r>
+        <w:t>disagreement</w:t>
+      </w:r>
+      <w:r>
+        <w:t xml:space="preserve"> decisions.</w:t>
       </w:r>
     </w:p>
     <w:p>
@@ -3030,7 +4418,19 @@
         </w:numPr>
       </w:pPr>
       <w:r>
-        <w:t>Users can view their contract history, payment records, and transaction status.</w:t>
+        <w:t xml:space="preserve">Users can view their contract history, payment </w:t>
+      </w:r>
+      <w:r>
+        <w:t>histories</w:t>
+      </w:r>
+      <w:r>
+        <w:t xml:space="preserve">, and </w:t>
+      </w:r>
+      <w:r>
+        <w:t>contract</w:t>
+      </w:r>
+      <w:r>
+        <w:t xml:space="preserve"> status.</w:t>
       </w:r>
     </w:p>
     <w:p>
@@ -3042,7 +4442,19 @@
         </w:numPr>
       </w:pPr>
       <w:r>
-        <w:t>The admin can manage users, contracts, payments, and system settings through a secure dashboard.</w:t>
+        <w:t xml:space="preserve">The admin can manage users, contracts, payments, and system settings </w:t>
+      </w:r>
+      <w:r>
+        <w:t>over</w:t>
+      </w:r>
+      <w:r>
+        <w:t xml:space="preserve"> a </w:t>
+      </w:r>
+      <w:r>
+        <w:t>safe</w:t>
+      </w:r>
+      <w:r>
+        <w:t xml:space="preserve"> dashboard.</w:t>
       </w:r>
     </w:p>
     <w:p>
@@ -3054,7 +4466,19 @@
         </w:numPr>
       </w:pPr>
       <w:r>
-        <w:t>The system maintains logs of all major activities for transparency and auditing.</w:t>
+        <w:t xml:space="preserve">The system </w:t>
+      </w:r>
+      <w:r>
+        <w:t>keeps</w:t>
+      </w:r>
+      <w:r>
+        <w:t xml:space="preserve"> logs of all major activities for transparency and </w:t>
+      </w:r>
+      <w:r>
+        <w:t>examining</w:t>
+      </w:r>
+      <w:r>
+        <w:t>.</w:t>
       </w:r>
     </w:p>
     <w:p>
@@ -3150,25 +4574,39 @@
           <w:sz w:val="23"/>
           <w:szCs w:val="23"/>
         </w:rPr>
-        <w:t xml:space="preserve"> GitHub provides a </w:t>
-      </w:r>
-      <w:proofErr w:type="gramStart"/>
-      <w:r>
-        <w:rPr>
-          <w:color w:val="000000"/>
-          <w:sz w:val="23"/>
-          <w:szCs w:val="23"/>
-        </w:rPr>
-        <w:t>cloud based</w:t>
-      </w:r>
-      <w:proofErr w:type="gramEnd"/>
-      <w:r>
-        <w:rPr>
-          <w:color w:val="000000"/>
-          <w:sz w:val="23"/>
-          <w:szCs w:val="23"/>
-        </w:rPr>
-        <w:t xml:space="preserve"> version control system that allows the entire team to collaborate on code, track changes, and merge updates safely without overwriting each other’s work</w:t>
+        <w:t xml:space="preserve"> GitHub </w:t>
+      </w:r>
+      <w:r>
+        <w:rPr>
+          <w:color w:val="000000"/>
+          <w:sz w:val="23"/>
+          <w:szCs w:val="23"/>
+        </w:rPr>
+        <w:t>offers</w:t>
+      </w:r>
+      <w:r>
+        <w:rPr>
+          <w:color w:val="000000"/>
+          <w:sz w:val="23"/>
+          <w:szCs w:val="23"/>
+        </w:rPr>
+        <w:t xml:space="preserve"> a cloud based version control system that allows the entire team to collaborate on code, </w:t>
+      </w:r>
+      <w:r>
+        <w:rPr>
+          <w:color w:val="000000"/>
+          <w:sz w:val="23"/>
+          <w:szCs w:val="23"/>
+        </w:rPr>
+        <w:t>trail</w:t>
+      </w:r>
+      <w:r>
+        <w:rPr>
+          <w:color w:val="000000"/>
+          <w:sz w:val="23"/>
+          <w:szCs w:val="23"/>
+        </w:rPr>
+        <w:t xml:space="preserve"> changes, and merge updates safely without overwriting each other’s work</w:t>
       </w:r>
     </w:p>
     <w:p>
@@ -3203,6 +4641,7 @@
           <w:sz w:val="23"/>
           <w:szCs w:val="23"/>
         </w:rPr>
+        <w:lastRenderedPageBreak/>
         <w:t>Jira</w:t>
       </w:r>
       <w:r>
@@ -3231,7 +4670,71 @@
           <w:sz w:val="23"/>
           <w:szCs w:val="23"/>
         </w:rPr>
-        <w:t xml:space="preserve">Jira supports Scrum and Kanban methodologies, helping the development team plan sprints, assign tasks, and track progress efficiently throughout the FYP lifecycle.  </w:t>
+        <w:t xml:space="preserve">Jira supports Scrum and Kanban </w:t>
+      </w:r>
+      <w:r>
+        <w:rPr>
+          <w:color w:val="000000"/>
+          <w:sz w:val="23"/>
+          <w:szCs w:val="23"/>
+        </w:rPr>
+        <w:t>practices</w:t>
+      </w:r>
+      <w:r>
+        <w:rPr>
+          <w:color w:val="000000"/>
+          <w:sz w:val="23"/>
+          <w:szCs w:val="23"/>
+        </w:rPr>
+        <w:t xml:space="preserve">, helping the development team plan sprints, </w:t>
+      </w:r>
+      <w:r>
+        <w:rPr>
+          <w:color w:val="000000"/>
+          <w:sz w:val="23"/>
+          <w:szCs w:val="23"/>
+        </w:rPr>
+        <w:t>allocate</w:t>
+      </w:r>
+      <w:r>
+        <w:rPr>
+          <w:color w:val="000000"/>
+          <w:sz w:val="23"/>
+          <w:szCs w:val="23"/>
+        </w:rPr>
+        <w:t xml:space="preserve"> tasks, and track </w:t>
+      </w:r>
+      <w:r>
+        <w:rPr>
+          <w:color w:val="000000"/>
+          <w:sz w:val="23"/>
+          <w:szCs w:val="23"/>
+        </w:rPr>
+        <w:t>development</w:t>
+      </w:r>
+      <w:r>
+        <w:rPr>
+          <w:color w:val="000000"/>
+          <w:sz w:val="23"/>
+          <w:szCs w:val="23"/>
+        </w:rPr>
+        <w:t xml:space="preserve"> </w:t>
+      </w:r>
+      <w:r>
+        <w:rPr>
+          <w:color w:val="000000"/>
+          <w:sz w:val="23"/>
+          <w:szCs w:val="23"/>
+        </w:rPr>
+        <w:t>proficiently</w:t>
+      </w:r>
+      <w:r>
+        <w:rPr>
+          <w:color w:val="000000"/>
+          <w:sz w:val="23"/>
+          <w:szCs w:val="23"/>
+        </w:rPr>
+        <w:t xml:space="preserve"> throughout the FYP lifecycle.  </w:t>
       </w:r>
     </w:p>
     <w:p>
@@ -3320,7 +4823,23 @@
           <w:sz w:val="23"/>
           <w:szCs w:val="23"/>
         </w:rPr>
-        <w:t>Component based, fast to build, large ecosystem (UI libraries, form handling). Next.js adds server-side rendering and easy routing if you want SEO friendly pages (landing, docs).</w:t>
+        <w:t>Component based, fast to build, large ecosystem (UI libraries, form handling). Next.js adds serve</w:t>
+      </w:r>
+      <w:r>
+        <w:rPr>
+          <w:color w:val="000000"/>
+          <w:sz w:val="23"/>
+          <w:szCs w:val="23"/>
+        </w:rPr>
+        <w:t xml:space="preserve"> </w:t>
+      </w:r>
+      <w:r>
+        <w:rPr>
+          <w:color w:val="000000"/>
+          <w:sz w:val="23"/>
+          <w:szCs w:val="23"/>
+        </w:rPr>
+        <w:t>side rendering and easy routing if you want SEO friendly pages (landing, docs).</w:t>
       </w:r>
     </w:p>
     <w:p>
@@ -3345,9 +4864,8 @@
           <w:sz w:val="23"/>
           <w:szCs w:val="23"/>
         </w:rPr>
-        <w:t>Backend (</w:t>
-      </w:r>
-      <w:proofErr w:type="spellStart"/>
+        <w:t>Backend (ExpressJS + NodeJS):</w:t>
+      </w:r>
       <w:r>
         <w:rPr>
           <w:b/>
@@ -3356,27 +4874,6 @@
           <w:sz w:val="23"/>
           <w:szCs w:val="23"/>
         </w:rPr>
-        <w:t>ExpressJS</w:t>
-      </w:r>
-      <w:proofErr w:type="spellEnd"/>
-      <w:r>
-        <w:rPr>
-          <w:b/>
-          <w:bCs/>
-          <w:color w:val="000000"/>
-          <w:sz w:val="23"/>
-          <w:szCs w:val="23"/>
-        </w:rPr>
-        <w:t xml:space="preserve"> + NodeJS):</w:t>
-      </w:r>
-      <w:r>
-        <w:rPr>
-          <w:b/>
-          <w:bCs/>
-          <w:color w:val="000000"/>
-          <w:sz w:val="23"/>
-          <w:szCs w:val="23"/>
-        </w:rPr>
         <w:t xml:space="preserve"> </w:t>
       </w:r>
       <w:r>
@@ -3385,25 +4882,7 @@
           <w:sz w:val="23"/>
           <w:szCs w:val="23"/>
         </w:rPr>
-        <w:t>Lightweight, JavaScript end-to-end (same language as frontend), vast middleware ecosystem, good for building REST/</w:t>
-      </w:r>
-      <w:proofErr w:type="spellStart"/>
-      <w:r>
-        <w:rPr>
-          <w:color w:val="000000"/>
-          <w:sz w:val="23"/>
-          <w:szCs w:val="23"/>
-        </w:rPr>
-        <w:t>GraphQL</w:t>
-      </w:r>
-      <w:proofErr w:type="spellEnd"/>
-      <w:r>
-        <w:rPr>
-          <w:color w:val="000000"/>
-          <w:sz w:val="23"/>
-          <w:szCs w:val="23"/>
-        </w:rPr>
-        <w:t> APIs.</w:t>
+        <w:t>Lightweight, JavaScript end-to-end (same language as frontend), vast middleware ecosystem, good for building REST/GraphQL APIs.</w:t>
       </w:r>
     </w:p>
     <w:p>
@@ -3518,25 +4997,7 @@
           <w:sz w:val="23"/>
           <w:szCs w:val="23"/>
         </w:rPr>
-        <w:t xml:space="preserve">tier cloud platforms, with React applications hosted on </w:t>
-      </w:r>
-      <w:proofErr w:type="spellStart"/>
-      <w:r>
-        <w:rPr>
-          <w:color w:val="000000"/>
-          <w:sz w:val="23"/>
-          <w:szCs w:val="23"/>
-        </w:rPr>
-        <w:t>Vercel</w:t>
-      </w:r>
-      <w:proofErr w:type="spellEnd"/>
-      <w:r>
-        <w:rPr>
-          <w:color w:val="000000"/>
-          <w:sz w:val="23"/>
-          <w:szCs w:val="23"/>
-        </w:rPr>
-        <w:t>, the backend on Render, and the database on MongoDB Atlas, making it cost</w:t>
+        <w:t>tier cloud platforms, with React applications hosted on Vercel, the backend on Render, and the database on MongoDB Atlas, making it cost</w:t>
       </w:r>
       <w:r>
         <w:rPr>
@@ -3613,8 +5074,6 @@
     <w:p>
       <w:pPr>
         <w:ind w:left="5760"/>
-      </w:pPr>
-      <w:r>
         <w:rPr>
           <w:b/>
           <w:bCs/>
@@ -3622,8 +5081,7 @@
           <w:sz w:val="23"/>
           <w:szCs w:val="23"/>
         </w:rPr>
-        <w:t>Supervisor Name</w:t>
-      </w:r>
+      </w:pPr>
       <w:r>
         <w:rPr>
           <w:b/>
@@ -3632,14 +5090,12 @@
           <w:sz w:val="23"/>
           <w:szCs w:val="23"/>
         </w:rPr>
-        <w:t xml:space="preserve"> &amp; Signature</w:t>
-      </w:r>
-    </w:p>
-    <w:p>
-      <w:pPr>
-        <w:autoSpaceDE w:val="0"/>
-        <w:autoSpaceDN w:val="0"/>
-        <w:adjustRightInd w:val="0"/>
+        <w:t>Supervisor:</w:t>
+      </w:r>
+    </w:p>
+    <w:p>
+      <w:pPr>
+        <w:ind w:left="5760"/>
         <w:rPr>
           <w:b/>
           <w:bCs/>
@@ -3647,12 +5103,30 @@
           <w:sz w:val="23"/>
           <w:szCs w:val="23"/>
         </w:rPr>
+      </w:pPr>
+    </w:p>
+    <w:p>
+      <w:pPr>
+        <w:ind w:left="5760"/>
         <w:sectPr>
           <w:pgSz w:w="12240" w:h="15840"/>
           <w:pgMar w:top="1400" w:right="1440" w:bottom="1660" w:left="1440" w:header="0" w:footer="1465" w:gutter="0"/>
           <w:cols w:space="720"/>
         </w:sectPr>
       </w:pPr>
+      <w:r>
+        <w:rPr>
+          <w:b/>
+          <w:bCs/>
+          <w:color w:val="000000"/>
+          <w:sz w:val="23"/>
+          <w:szCs w:val="23"/>
+        </w:rPr>
+        <w:t>Signature</w:t>
+      </w:r>
+      <w:r>
+        <w:t>: _____________</w:t>
+      </w:r>
     </w:p>
     <w:p>
       <w:pPr>

</xml_diff>